<commit_message>
feat: adiciona atualizações no artigo cientifico.
</commit_message>
<xml_diff>
--- a/docs/Artigo_Cientifico_Complexo_Maromba.docx
+++ b/docs/Artigo_Cientifico_Complexo_Maromba.docx
@@ -27,7 +27,7 @@
           <w:iCs w:val="0"/>
           <w:smallCaps w:val="0"/>
           <w:strike w:val="0"/>
-          <w:color w:val="000000"/>
+          <w:color w:val="4f81bd"/>
           <w:sz w:val="28"/>
           <w:szCs w:val="28"/>
           <w:u w:val="none"/>
@@ -44,7 +44,7 @@
           <w:iCs w:val="0"/>
           <w:smallCaps w:val="0"/>
           <w:strike w:val="0"/>
-          <w:color w:val="000000"/>
+          <w:color w:val="4f81bd"/>
           <w:sz w:val="28"/>
           <w:szCs w:val="28"/>
           <w:u w:val="none"/>
@@ -212,8 +212,8 @@
           <w:smallCaps w:val="0"/>
           <w:strike w:val="0"/>
           <w:color w:val="000000"/>
-          <w:sz w:val="20"/>
-          <w:szCs w:val="20"/>
+          <w:sz w:val="22"/>
+          <w:szCs w:val="22"/>
           <w:u w:val="none"/>
           <w:shd w:fill="auto" w:val="clear"/>
           <w:vertAlign w:val="baseline"/>
@@ -229,14 +229,41 @@
           <w:smallCaps w:val="0"/>
           <w:strike w:val="0"/>
           <w:color w:val="000000"/>
-          <w:sz w:val="20"/>
-          <w:szCs w:val="20"/>
-          <w:u w:val="none"/>
-          <w:shd w:fill="auto" w:val="clear"/>
-          <w:vertAlign w:val="baseline"/>
-          <w:rtl w:val="0"/>
-        </w:rPr>
-        <w:t xml:space="preserve">Este artigo apresenta a modelagem, organização e implementação do banco de dados do projeto Complexo Maromba, uma aplicação acadêmica voltada ao gerenciamento de uma academia fictícia. O trabalho teve como foco a camada de banco de dados do Projeto Integrador IV, com ênfase na migração da estrutura anteriormente desenvolvida em MySQL para PostgreSQL. A versão atual foi organizada em schemas com responsabilidades distintas, principalmente admin, site e contabil. O schema admin concentra as estruturas administrativas e operacionais, incluindo clientes, funcionários, matrículas, planos, treinos, exercícios, produtos, vendas, pagamentos e estoque. O schema site disponibiliza views destinadas a simplificar consultas utilizadas pela aplicação, enquanto o schema contabil reúne o plano de contas e os lançamentos contábeis. Também foram aplicadas chaves primárias e estrangeiras, restrições CHECK, regras de ON DELETE e ON UPDATE, tipos enumerados e views. A organização dos scripts em etapas de criação, relacionamento, validação, consulta e carga de dados favorece a reprodução do banco em outros ambientes. Como resultado, obteve-se uma estrutura relacional organizada em PostgreSQL, com mecanismos de integridade e consultas reutilizáveis, permitindo aplicar na prática conceitos de modelagem, SQL, relacionamentos e gerenciamento de banco de dados.</w:t>
+          <w:sz w:val="22"/>
+          <w:szCs w:val="22"/>
+          <w:u w:val="none"/>
+          <w:shd w:fill="auto" w:val="clear"/>
+          <w:vertAlign w:val="baseline"/>
+          <w:rtl w:val="0"/>
+        </w:rPr>
+        <w:t xml:space="preserve">Este artigo apresenta a modelagem, organização e implementação do banco de dados do projeto Complexo Maromba, uma aplicação acadêmica voltada ao gerenciamento de uma academia fictícia. O trabalho teve como foco a camada de banco de dados do Projeto Integrador IV, com ênfase na migração da estrutura anteriormente desenvolvida em MySQL para PostgreSQL. A versão atual foi organizada em schemas com responsabilidades distintas, principalmente admin, site e contabil. O schema admin concentra as estruturas administrativas e operacionais, incluindo clientes, funcionários, matrículas, planos, treinos, exercícios, produtos, vendas, pagamentos e estoque. O</w:t>
+      </w:r>
+      <w:r>
+        <w:rPr>
+          <w:sz w:val="22"/>
+          <w:szCs w:val="22"/>
+          <w:rtl w:val="0"/>
+        </w:rPr>
+        <w:t xml:space="preserve"> </w:t>
+      </w:r>
+      <w:r>
+        <w:rPr>
+          <w:rFonts w:ascii="Times New Roman" w:cs="Times New Roman" w:eastAsia="Times New Roman" w:hAnsi="Times New Roman"/>
+          <w:b w:val="0"/>
+          <w:bCs w:val="0"/>
+          <w:i w:val="0"/>
+          <w:iCs w:val="0"/>
+          <w:smallCaps w:val="0"/>
+          <w:strike w:val="0"/>
+          <w:color w:val="000000"/>
+          <w:sz w:val="22"/>
+          <w:szCs w:val="22"/>
+          <w:u w:val="none"/>
+          <w:shd w:fill="auto" w:val="clear"/>
+          <w:vertAlign w:val="baseline"/>
+          <w:rtl w:val="0"/>
+        </w:rPr>
+        <w:t xml:space="preserve">schema site disponibiliza views destinadas a simplificar consultas utilizadas pela aplicação, enquanto o schema contabil reúne o plano de contas e os lançamentos contábeis. Também foram aplicadas chaves primárias e estrangeiras, restrições CHECK, regras de ON DELETE e ON UPDATE, tipos enumerados e views. A organização dos scripts em etapas de criação, relacionamento, validação, consulta e carga de dados favorece a reprodução do banco em outros ambientes. Como resultado, obteve-se uma estrutura relacional organizada em PostgreSQL, com mecanismos de integridade e consultas reutilizáveis, permitindo aplicar na prática conceitos de modelagem, SQL, relacionamentos e gerenciamento de banco de dados.</w:t>
       </w:r>
     </w:p>
     <w:p>
@@ -265,8 +292,8 @@
           <w:smallCaps w:val="0"/>
           <w:strike w:val="0"/>
           <w:color w:val="000000"/>
-          <w:sz w:val="20"/>
-          <w:szCs w:val="20"/>
+          <w:sz w:val="22"/>
+          <w:szCs w:val="22"/>
           <w:u w:val="none"/>
           <w:shd w:fill="auto" w:val="clear"/>
           <w:vertAlign w:val="baseline"/>
@@ -282,8 +309,8 @@
           <w:smallCaps w:val="0"/>
           <w:strike w:val="0"/>
           <w:color w:val="000000"/>
-          <w:sz w:val="20"/>
-          <w:szCs w:val="20"/>
+          <w:sz w:val="22"/>
+          <w:szCs w:val="22"/>
           <w:u w:val="none"/>
           <w:shd w:fill="auto" w:val="clear"/>
           <w:vertAlign w:val="baseline"/>
@@ -342,7 +369,34 @@
           <w:vertAlign w:val="baseline"/>
           <w:rtl w:val="0"/>
         </w:rPr>
-        <w:t xml:space="preserve">1 INTRODUÇÃO</w:t>
+        <w:t xml:space="preserve">1 </w:t>
+      </w:r>
+      <w:r>
+        <w:rPr>
+          <w:b w:val="1"/>
+          <w:bCs w:val="1"/>
+          <w:rtl w:val="0"/>
+        </w:rPr>
+        <w:t xml:space="preserve">- </w:t>
+      </w:r>
+      <w:r>
+        <w:rPr>
+          <w:rFonts w:ascii="Times New Roman" w:cs="Times New Roman" w:eastAsia="Times New Roman" w:hAnsi="Times New Roman"/>
+          <w:b w:val="1"/>
+          <w:bCs w:val="1"/>
+          <w:i w:val="0"/>
+          <w:iCs w:val="0"/>
+          <w:smallCaps w:val="0"/>
+          <w:strike w:val="0"/>
+          <w:color w:val="000000"/>
+          <w:sz w:val="24"/>
+          <w:szCs w:val="24"/>
+          <w:u w:val="none"/>
+          <w:shd w:fill="auto" w:val="clear"/>
+          <w:vertAlign w:val="baseline"/>
+          <w:rtl w:val="0"/>
+        </w:rPr>
+        <w:t xml:space="preserve">INTRODUÇÃO</w:t>
       </w:r>
     </w:p>
     <w:p>
@@ -428,7 +482,34 @@
           <w:vertAlign w:val="baseline"/>
           <w:rtl w:val="0"/>
         </w:rPr>
-        <w:t xml:space="preserve">2 OBJETIVOS</w:t>
+        <w:t xml:space="preserve">2</w:t>
+      </w:r>
+      <w:r>
+        <w:rPr>
+          <w:b w:val="1"/>
+          <w:bCs w:val="1"/>
+          <w:rtl w:val="0"/>
+        </w:rPr>
+        <w:t xml:space="preserve"> - </w:t>
+      </w:r>
+      <w:r>
+        <w:rPr>
+          <w:rFonts w:ascii="Times New Roman" w:cs="Times New Roman" w:eastAsia="Times New Roman" w:hAnsi="Times New Roman"/>
+          <w:b w:val="1"/>
+          <w:bCs w:val="1"/>
+          <w:i w:val="0"/>
+          <w:iCs w:val="0"/>
+          <w:smallCaps w:val="0"/>
+          <w:strike w:val="0"/>
+          <w:color w:val="000000"/>
+          <w:sz w:val="24"/>
+          <w:szCs w:val="24"/>
+          <w:u w:val="none"/>
+          <w:shd w:fill="auto" w:val="clear"/>
+          <w:vertAlign w:val="baseline"/>
+          <w:rtl w:val="0"/>
+        </w:rPr>
+        <w:t xml:space="preserve">OBJETIVOS</w:t>
       </w:r>
     </w:p>
     <w:p>
@@ -481,7 +562,7 @@
           <w:vertAlign w:val="baseline"/>
           <w:rtl w:val="0"/>
         </w:rPr>
-        <w:t xml:space="preserve">2.1 Objetivo geral</w:t>
+        <w:t xml:space="preserve">2.1 -  Objetivo geral</w:t>
       </w:r>
     </w:p>
     <w:p>
@@ -545,7 +626,7 @@
           <w:vertAlign w:val="baseline"/>
           <w:rtl w:val="0"/>
         </w:rPr>
-        <w:t xml:space="preserve">2.2 Objetivos específicos</w:t>
+        <w:t xml:space="preserve">2.2 - Objetivos específicos</w:t>
       </w:r>
     </w:p>
     <w:p>
@@ -706,7 +787,7 @@
           <w:vertAlign w:val="baseline"/>
           <w:rtl w:val="0"/>
         </w:rPr>
-        <w:t xml:space="preserve">3 FUNDAMENTAÇÃO</w:t>
+        <w:t xml:space="preserve">3 -  FUNDAMENTAÇÃO</w:t>
       </w:r>
     </w:p>
     <w:p>
@@ -781,7 +862,7 @@
           <w:vertAlign w:val="baseline"/>
           <w:rtl w:val="0"/>
         </w:rPr>
-        <w:t xml:space="preserve">4 METODOLOGIA</w:t>
+        <w:t xml:space="preserve">4 -  METODOLOGIA</w:t>
       </w:r>
     </w:p>
     <w:p>
@@ -867,7 +948,7 @@
           <w:vertAlign w:val="baseline"/>
           <w:rtl w:val="0"/>
         </w:rPr>
-        <w:t xml:space="preserve">5 MODELAGEM E ESTRUTURA DO BANCO DE DADOS</w:t>
+        <w:t xml:space="preserve">5 -  MODELAGEM E ESTRUTURA DO BANCO DE DADOS</w:t>
       </w:r>
     </w:p>
     <w:p>
@@ -1359,29 +1440,99 @@
           <w:vertAlign w:val="baseline"/>
           <w:rtl w:val="0"/>
         </w:rPr>
-        <w:t xml:space="preserve">6 MIGRAÇÃO DO MYSQL PARA POSTGRESQL</w:t>
-      </w:r>
-    </w:p>
-    <w:p>
-      <w:pPr>
-        <w:rPr/>
-      </w:pPr>
-      <w:r>
-        <w:rPr>
-          <w:rtl w:val="0"/>
-        </w:rPr>
-        <w:t xml:space="preserve">A migração foi realizada a partir da estrutura anterior em MySQL, com adaptação dos scripts para a sintaxe e os recursos do PostgreSQL. Entre as alterações utilizadas estão a adoção do tipo SERIAL para identificadores, a criação explícita de schemas e a utilização de tipos ENUM no módulo contábil.</w:t>
-      </w:r>
-    </w:p>
-    <w:p>
-      <w:pPr>
-        <w:rPr/>
-      </w:pPr>
-      <w:r>
-        <w:rPr>
-          <w:rtl w:val="0"/>
-        </w:rPr>
-        <w:t xml:space="preserve">Além da adaptação sintática, o processo envolveu a revisão dos relacionamentos e das regras de integridade. As chaves estrangeiras foram definidas com ações ON DELETE e ON UPDATE adequadas à dependência entre os registros. Também foram adicionadas restrições CHECK para impedir valores inválidos em situações determinadas pelo projeto.</w:t>
+        <w:t xml:space="preserve">6 -  MIGRAÇÃO DO MYSQL PARA POSTGRESQL</w:t>
+      </w:r>
+    </w:p>
+    <w:p>
+      <w:pPr>
+        <w:rPr/>
+      </w:pPr>
+      <w:r>
+        <w:rPr>
+          <w:rtl w:val="0"/>
+        </w:rPr>
+        <w:t xml:space="preserve">A migração foi realizada a partir da estrutura anterior em MySQL, com adaptação dos scripts para a sintaxe e os recursos do PostgreSQL. Entre as alterações utilizadas estão a adoção do tipo </w:t>
+      </w:r>
+      <w:r>
+        <w:rPr>
+          <w:b w:val="1"/>
+          <w:bCs w:val="1"/>
+          <w:rtl w:val="0"/>
+        </w:rPr>
+        <w:t xml:space="preserve">SERIAL</w:t>
+      </w:r>
+      <w:r>
+        <w:rPr>
+          <w:rtl w:val="0"/>
+        </w:rPr>
+        <w:t xml:space="preserve"> para identificadores, a criação explícita de schemas e a utilização de tipos </w:t>
+      </w:r>
+      <w:r>
+        <w:rPr>
+          <w:b w:val="1"/>
+          <w:bCs w:val="1"/>
+          <w:rtl w:val="0"/>
+        </w:rPr>
+        <w:t xml:space="preserve">ENUM</w:t>
+      </w:r>
+      <w:r>
+        <w:rPr>
+          <w:rtl w:val="0"/>
+        </w:rPr>
+        <w:t xml:space="preserve"> no módulo contábil.</w:t>
+      </w:r>
+    </w:p>
+    <w:p>
+      <w:pPr>
+        <w:rPr/>
+      </w:pPr>
+      <w:r>
+        <w:rPr>
+          <w:rtl w:val="0"/>
+        </w:rPr>
+        <w:t xml:space="preserve">Além da adaptação sintática, o processo envolveu a revisão dos relacionamentos e das regras de integridade. As chaves estrangeiras foram definidas com ações </w:t>
+      </w:r>
+      <w:r>
+        <w:rPr>
+          <w:b w:val="1"/>
+          <w:bCs w:val="1"/>
+          <w:rtl w:val="0"/>
+        </w:rPr>
+        <w:t xml:space="preserve">ON DELETE</w:t>
+      </w:r>
+      <w:r>
+        <w:rPr>
+          <w:rtl w:val="0"/>
+        </w:rPr>
+        <w:t xml:space="preserve"> e </w:t>
+      </w:r>
+      <w:r>
+        <w:rPr>
+          <w:b w:val="1"/>
+          <w:bCs w:val="1"/>
+          <w:rtl w:val="0"/>
+        </w:rPr>
+        <w:t xml:space="preserve">ON UPDATE</w:t>
+      </w:r>
+      <w:r>
+        <w:rPr>
+          <w:rtl w:val="0"/>
+        </w:rPr>
+        <w:t xml:space="preserve"> adequadas à dependência entre os registros. Também foram adicionadas restrições </w:t>
+      </w:r>
+      <w:r>
+        <w:rPr>
+          <w:b w:val="1"/>
+          <w:bCs w:val="1"/>
+          <w:rtl w:val="0"/>
+        </w:rPr>
+        <w:t xml:space="preserve">CHECK </w:t>
+      </w:r>
+      <w:r>
+        <w:rPr>
+          <w:rtl w:val="0"/>
+        </w:rPr>
+        <w:t xml:space="preserve">para impedir valores inválidos em situações determinadas pelo projeto.</w:t>
       </w:r>
     </w:p>
     <w:p>
@@ -1445,29 +1596,141 @@
           <w:vertAlign w:val="baseline"/>
           <w:rtl w:val="0"/>
         </w:rPr>
-        <w:t xml:space="preserve">7 INTEGRIDADE E REGRAS DE VALIDAÇÃO</w:t>
-      </w:r>
-    </w:p>
-    <w:p>
-      <w:pPr>
-        <w:rPr/>
-      </w:pPr>
-      <w:r>
-        <w:rPr>
-          <w:rtl w:val="0"/>
-        </w:rPr>
-        <w:t xml:space="preserve">A integridade dos dados foi tratada por meio de chaves primárias, chaves estrangeiras, restrições UNIQUE, campos NOT NULL e CHECK. No caso dos pagamentos, a constraint chk_valor_positivo impede valores menores ou iguais a zero. A constraint chk_status_valido limita o status aos valores pago, pendente e atrasado.</w:t>
-      </w:r>
-    </w:p>
-    <w:p>
-      <w:pPr>
-        <w:rPr/>
-      </w:pPr>
-      <w:r>
-        <w:rPr>
-          <w:rtl w:val="0"/>
-        </w:rPr>
-        <w:t xml:space="preserve">Também foram estabelecidas regras para gênero e modalidade de clientes, restringindo os valores aos conjuntos definidos no projeto. As chaves estrangeiras utilizam CASCADE, RESTRICT ou SET NULL de acordo com a dependência entre os registros. Por exemplo, itens de uma venda podem ser excluídos junto com a venda, enquanto produtos relacionados ao histórico de vendas não devem ser removidos sem preservar a consistência dos registros.</w:t>
+        <w:t xml:space="preserve">7 -  INTEGRIDADE E REGRAS DE VALIDAÇÃO</w:t>
+      </w:r>
+    </w:p>
+    <w:p>
+      <w:pPr>
+        <w:rPr/>
+      </w:pPr>
+      <w:r>
+        <w:rPr>
+          <w:rtl w:val="0"/>
+        </w:rPr>
+        <w:t xml:space="preserve">A integridade dos dados foi tratada por meio de chaves primárias, chaves estrangeiras, restrições </w:t>
+      </w:r>
+      <w:r>
+        <w:rPr>
+          <w:b w:val="1"/>
+          <w:bCs w:val="1"/>
+          <w:rtl w:val="0"/>
+        </w:rPr>
+        <w:t xml:space="preserve">UNIQUE</w:t>
+      </w:r>
+      <w:r>
+        <w:rPr>
+          <w:rtl w:val="0"/>
+        </w:rPr>
+        <w:t xml:space="preserve">, campos </w:t>
+      </w:r>
+      <w:r>
+        <w:rPr>
+          <w:b w:val="1"/>
+          <w:bCs w:val="1"/>
+          <w:rtl w:val="0"/>
+        </w:rPr>
+        <w:t xml:space="preserve">NOT NULL</w:t>
+      </w:r>
+      <w:r>
+        <w:rPr>
+          <w:rtl w:val="0"/>
+        </w:rPr>
+        <w:t xml:space="preserve"> e </w:t>
+      </w:r>
+      <w:r>
+        <w:rPr>
+          <w:b w:val="1"/>
+          <w:bCs w:val="1"/>
+          <w:rtl w:val="0"/>
+        </w:rPr>
+        <w:t xml:space="preserve">CHECK</w:t>
+      </w:r>
+      <w:r>
+        <w:rPr>
+          <w:rtl w:val="0"/>
+        </w:rPr>
+        <w:t xml:space="preserve">. No caso dos pagamentos, a constraint </w:t>
+      </w:r>
+      <w:r>
+        <w:rPr>
+          <w:b w:val="1"/>
+          <w:bCs w:val="1"/>
+          <w:rtl w:val="0"/>
+        </w:rPr>
+        <w:t xml:space="preserve">chk_valor_positivo</w:t>
+      </w:r>
+      <w:r>
+        <w:rPr>
+          <w:rtl w:val="0"/>
+        </w:rPr>
+        <w:t xml:space="preserve"> impede valores menores ou iguais a zero. A constraint </w:t>
+      </w:r>
+      <w:r>
+        <w:rPr>
+          <w:b w:val="1"/>
+          <w:bCs w:val="1"/>
+          <w:rtl w:val="0"/>
+        </w:rPr>
+        <w:t xml:space="preserve">chk_status_valido</w:t>
+      </w:r>
+      <w:r>
+        <w:rPr>
+          <w:rtl w:val="0"/>
+        </w:rPr>
+        <w:t xml:space="preserve"> limita o status aos valores pago, pendente e atrasado.</w:t>
+      </w:r>
+    </w:p>
+    <w:p>
+      <w:pPr>
+        <w:rPr/>
+      </w:pPr>
+      <w:r>
+        <w:rPr>
+          <w:rtl w:val="0"/>
+        </w:rPr>
+        <w:t xml:space="preserve">Também foram estabelecidas regras para gênero e modalidade de clientes, restringindo os valores aos conjuntos definidos no projeto. As chaves estrangeiras utilizam</w:t>
+      </w:r>
+      <w:r>
+        <w:rPr>
+          <w:b w:val="1"/>
+          <w:bCs w:val="1"/>
+          <w:rtl w:val="0"/>
+        </w:rPr>
+        <w:t xml:space="preserve"> CASCADE</w:t>
+      </w:r>
+      <w:r>
+        <w:rPr>
+          <w:rtl w:val="0"/>
+        </w:rPr>
+        <w:t xml:space="preserve">, </w:t>
+      </w:r>
+      <w:r>
+        <w:rPr>
+          <w:b w:val="1"/>
+          <w:bCs w:val="1"/>
+          <w:rtl w:val="0"/>
+        </w:rPr>
+        <w:t xml:space="preserve">RESTRICT</w:t>
+      </w:r>
+      <w:r>
+        <w:rPr>
+          <w:rtl w:val="0"/>
+        </w:rPr>
+        <w:t xml:space="preserve"> ou </w:t>
+      </w:r>
+      <w:r>
+        <w:rPr>
+          <w:b w:val="1"/>
+          <w:bCs w:val="1"/>
+          <w:rtl w:val="0"/>
+        </w:rPr>
+        <w:t xml:space="preserve">SET NULL</w:t>
+      </w:r>
+      <w:r>
+        <w:rPr>
+          <w:rtl w:val="0"/>
+        </w:rPr>
+        <w:t xml:space="preserve"> de acordo com a dependência entre os registros. Por exemplo, itens de uma venda podem ser excluídos junto com a venda, enquanto produtos relacionados ao histórico de vendas não devem ser removidos sem preservar a consistência dos registros.</w:t>
       </w:r>
     </w:p>
     <w:p>
@@ -1531,29 +1794,99 @@
           <w:vertAlign w:val="baseline"/>
           <w:rtl w:val="0"/>
         </w:rPr>
-        <w:t xml:space="preserve">8 VIEWS E ORGANIZAÇÃO DAS CONSULTAS</w:t>
-      </w:r>
-    </w:p>
-    <w:p>
-      <w:pPr>
-        <w:rPr/>
-      </w:pPr>
-      <w:r>
-        <w:rPr>
-          <w:rtl w:val="0"/>
-        </w:rPr>
-        <w:t xml:space="preserve">As views foram utilizadas para encapsular consultas que envolvem várias tabelas. No schema site, a view vw_treinos_cadastrados reúne dados de cliente, funcionário, treino e exercícios, facilitando a apresentação dos treinos na aplicação. A view vw_pagamentos_cliente reúne informações do cliente, forma de pagamento, valor, data e status.</w:t>
-      </w:r>
-    </w:p>
-    <w:p>
-      <w:pPr>
-        <w:rPr/>
-      </w:pPr>
-      <w:r>
-        <w:rPr>
-          <w:rtl w:val="0"/>
-        </w:rPr>
-        <w:t xml:space="preserve">No schema admin, as views vw_lista_clientes e vw_lista_funcionarios simplificam consultas administrativas. No schema contabil, a view plano_lancamentos combina lançamentos com o plano de contas para apresentar as contas de débito e crédito e os respectivos valores.</w:t>
+        <w:t xml:space="preserve">8 -  VIEWS E ORGANIZAÇÃO DAS CONSULTAS</w:t>
+      </w:r>
+    </w:p>
+    <w:p>
+      <w:pPr>
+        <w:rPr/>
+      </w:pPr>
+      <w:r>
+        <w:rPr>
+          <w:rtl w:val="0"/>
+        </w:rPr>
+        <w:t xml:space="preserve">As views foram utilizadas para encapsular consultas que envolvem várias tabelas. No schema </w:t>
+      </w:r>
+      <w:r>
+        <w:rPr>
+          <w:b w:val="1"/>
+          <w:bCs w:val="1"/>
+          <w:rtl w:val="0"/>
+        </w:rPr>
+        <w:t xml:space="preserve">site</w:t>
+      </w:r>
+      <w:r>
+        <w:rPr>
+          <w:rtl w:val="0"/>
+        </w:rPr>
+        <w:t xml:space="preserve">, a view </w:t>
+      </w:r>
+      <w:r>
+        <w:rPr>
+          <w:b w:val="1"/>
+          <w:bCs w:val="1"/>
+          <w:rtl w:val="0"/>
+        </w:rPr>
+        <w:t xml:space="preserve">vw_treinos_cadastrados</w:t>
+      </w:r>
+      <w:r>
+        <w:rPr>
+          <w:rtl w:val="0"/>
+        </w:rPr>
+        <w:t xml:space="preserve"> reúne dados de cliente, funcionário, treino e exercícios, facilitando a apresentação dos treinos na aplicação. A view vw_pagamentos_cliente reúne informações do cliente, forma de pagamento, valor, data e status.</w:t>
+      </w:r>
+    </w:p>
+    <w:p>
+      <w:pPr>
+        <w:rPr/>
+      </w:pPr>
+      <w:r>
+        <w:rPr>
+          <w:rtl w:val="0"/>
+        </w:rPr>
+        <w:t xml:space="preserve">No schema admin, as views vw_lista_clientes e </w:t>
+      </w:r>
+      <w:r>
+        <w:rPr>
+          <w:b w:val="1"/>
+          <w:bCs w:val="1"/>
+          <w:rtl w:val="0"/>
+        </w:rPr>
+        <w:t xml:space="preserve">vw_lista_funcionarios</w:t>
+      </w:r>
+      <w:r>
+        <w:rPr>
+          <w:rtl w:val="0"/>
+        </w:rPr>
+        <w:t xml:space="preserve"> simplificam consultas administrativas. No schema </w:t>
+      </w:r>
+      <w:r>
+        <w:rPr>
+          <w:b w:val="1"/>
+          <w:bCs w:val="1"/>
+          <w:rtl w:val="0"/>
+        </w:rPr>
+        <w:t xml:space="preserve">contabil</w:t>
+      </w:r>
+      <w:r>
+        <w:rPr>
+          <w:rtl w:val="0"/>
+        </w:rPr>
+        <w:t xml:space="preserve">, a view </w:t>
+      </w:r>
+      <w:r>
+        <w:rPr>
+          <w:b w:val="1"/>
+          <w:bCs w:val="1"/>
+          <w:rtl w:val="0"/>
+        </w:rPr>
+        <w:t xml:space="preserve">vw_plano_lancamentos</w:t>
+      </w:r>
+      <w:r>
+        <w:rPr>
+          <w:rtl w:val="0"/>
+        </w:rPr>
+        <w:t xml:space="preserve"> combina lançamentos com o plano de contas para apresentar as contas de débito e crédito e os respectivos valores.</w:t>
       </w:r>
     </w:p>
     <w:p>
@@ -1617,7 +1950,7 @@
           <w:vertAlign w:val="baseline"/>
           <w:rtl w:val="0"/>
         </w:rPr>
-        <w:t xml:space="preserve">9 CARGA E ORGANIZAÇÃO DOS DADOS</w:t>
+        <w:t xml:space="preserve">9 -  CARGA E ORGANIZAÇÃO DOS DADOS</w:t>
       </w:r>
     </w:p>
     <w:p>
@@ -1640,6 +1973,355 @@
           <w:rtl w:val="0"/>
         </w:rPr>
         <w:t xml:space="preserve">A ordem de execução também considera as dependências entre os objetos. As tabelas do schema admin precisam existir antes das views do schema site, pois as consultas dessas views utilizam diretamente as tabelas administrativas. O módulo contábil é criado com seu plano de contas e lançamentos antes da criação da view correspondente.</w:t>
+      </w:r>
+    </w:p>
+    <w:p>
+      <w:pPr>
+        <w:rPr/>
+      </w:pPr>
+      <w:r>
+        <w:rPr>
+          <w:rtl w:val="0"/>
+        </w:rPr>
+      </w:r>
+    </w:p>
+    <w:p>
+      <w:pPr>
+        <w:ind w:left="0" w:firstLine="0"/>
+        <w:rPr>
+          <w:b w:val="1"/>
+          <w:bCs w:val="1"/>
+        </w:rPr>
+      </w:pPr>
+      <w:r>
+        <w:rPr>
+          <w:b w:val="1"/>
+          <w:bCs w:val="1"/>
+          <w:rtl w:val="0"/>
+        </w:rPr>
+        <w:t xml:space="preserve">10 - FUNÇÃO E TRIGGERS</w:t>
+      </w:r>
+    </w:p>
+    <w:p>
+      <w:pPr>
+        <w:ind w:left="0" w:firstLine="0"/>
+        <w:rPr/>
+      </w:pPr>
+      <w:r>
+        <w:rPr>
+          <w:b w:val="1"/>
+          <w:bCs w:val="1"/>
+          <w:rtl w:val="0"/>
+        </w:rPr>
+        <w:tab/>
+      </w:r>
+      <w:r>
+        <w:rPr>
+          <w:rtl w:val="0"/>
+        </w:rPr>
+        <w:t xml:space="preserve">Foi adicionado uma função em PL/PGSQL para fazer um controle do saldo referente a natureza das contas, com base nessa regra :</w:t>
+      </w:r>
+    </w:p>
+    <w:p>
+      <w:pPr>
+        <w:ind w:firstLine="0"/>
+        <w:rPr/>
+      </w:pPr>
+      <w:r>
+        <w:rPr>
+          <w:b w:val="1"/>
+          <w:bCs w:val="1"/>
+          <w:rtl w:val="0"/>
+        </w:rPr>
+        <w:t xml:space="preserve">DEVEDORA</w:t>
+      </w:r>
+      <w:r>
+        <w:rPr>
+          <w:rtl w:val="0"/>
+        </w:rPr>
+        <w:t xml:space="preserve"> - o saldo </w:t>
+      </w:r>
+      <w:r>
+        <w:rPr>
+          <w:b w:val="1"/>
+          <w:bCs w:val="1"/>
+          <w:rtl w:val="0"/>
+        </w:rPr>
+        <w:t xml:space="preserve">aumenta</w:t>
+      </w:r>
+      <w:r>
+        <w:rPr>
+          <w:rtl w:val="0"/>
+        </w:rPr>
+        <w:t xml:space="preserve"> quando a conta é </w:t>
+      </w:r>
+      <w:r>
+        <w:rPr>
+          <w:b w:val="1"/>
+          <w:bCs w:val="1"/>
+          <w:rtl w:val="0"/>
+        </w:rPr>
+        <w:t xml:space="preserve">debitada</w:t>
+      </w:r>
+      <w:r>
+        <w:rPr>
+          <w:rtl w:val="0"/>
+        </w:rPr>
+        <w:t xml:space="preserve">, o saldo </w:t>
+      </w:r>
+      <w:r>
+        <w:rPr>
+          <w:b w:val="1"/>
+          <w:bCs w:val="1"/>
+          <w:rtl w:val="0"/>
+        </w:rPr>
+        <w:t xml:space="preserve">diminui</w:t>
+      </w:r>
+      <w:r>
+        <w:rPr>
+          <w:rtl w:val="0"/>
+        </w:rPr>
+        <w:t xml:space="preserve"> quando a conta é </w:t>
+      </w:r>
+      <w:r>
+        <w:rPr>
+          <w:b w:val="1"/>
+          <w:bCs w:val="1"/>
+          <w:rtl w:val="0"/>
+        </w:rPr>
+        <w:t xml:space="preserve">creditada</w:t>
+      </w:r>
+      <w:r>
+        <w:rPr>
+          <w:rtl w:val="0"/>
+        </w:rPr>
+        <w:t xml:space="preserve">.</w:t>
+      </w:r>
+    </w:p>
+    <w:p>
+      <w:pPr>
+        <w:ind w:firstLine="0"/>
+        <w:rPr/>
+      </w:pPr>
+      <w:r>
+        <w:rPr>
+          <w:b w:val="1"/>
+          <w:bCs w:val="1"/>
+          <w:rtl w:val="0"/>
+        </w:rPr>
+        <w:t xml:space="preserve">CREDORA</w:t>
+      </w:r>
+      <w:r>
+        <w:rPr>
+          <w:rtl w:val="0"/>
+        </w:rPr>
+        <w:t xml:space="preserve"> - o saldo </w:t>
+      </w:r>
+      <w:r>
+        <w:rPr>
+          <w:b w:val="1"/>
+          <w:bCs w:val="1"/>
+          <w:rtl w:val="0"/>
+        </w:rPr>
+        <w:t xml:space="preserve">diminui</w:t>
+      </w:r>
+      <w:r>
+        <w:rPr>
+          <w:rtl w:val="0"/>
+        </w:rPr>
+        <w:t xml:space="preserve"> quando a conta é </w:t>
+      </w:r>
+      <w:r>
+        <w:rPr>
+          <w:b w:val="1"/>
+          <w:bCs w:val="1"/>
+          <w:rtl w:val="0"/>
+        </w:rPr>
+        <w:t xml:space="preserve">debitada</w:t>
+      </w:r>
+      <w:r>
+        <w:rPr>
+          <w:rtl w:val="0"/>
+        </w:rPr>
+        <w:t xml:space="preserve">, o saldo </w:t>
+      </w:r>
+      <w:r>
+        <w:rPr>
+          <w:b w:val="1"/>
+          <w:bCs w:val="1"/>
+          <w:rtl w:val="0"/>
+        </w:rPr>
+        <w:t xml:space="preserve">aumenta</w:t>
+      </w:r>
+      <w:r>
+        <w:rPr>
+          <w:rtl w:val="0"/>
+        </w:rPr>
+        <w:t xml:space="preserve"> quando a conta é </w:t>
+      </w:r>
+      <w:r>
+        <w:rPr>
+          <w:b w:val="1"/>
+          <w:bCs w:val="1"/>
+          <w:rtl w:val="0"/>
+        </w:rPr>
+        <w:t xml:space="preserve">creditada</w:t>
+      </w:r>
+      <w:r>
+        <w:rPr>
+          <w:rtl w:val="0"/>
+        </w:rPr>
+        <w:t xml:space="preserve">.</w:t>
+      </w:r>
+    </w:p>
+    <w:p>
+      <w:pPr>
+        <w:ind w:left="0" w:firstLine="0"/>
+        <w:rPr/>
+      </w:pPr>
+      <w:r>
+        <w:rPr>
+          <w:rtl w:val="0"/>
+        </w:rPr>
+        <w:t xml:space="preserve"> </w:t>
+        <w:tab/>
+        <w:t xml:space="preserve">Essa Função foi utilizada para criar uma trigger </w:t>
+      </w:r>
+      <w:r>
+        <w:rPr>
+          <w:b w:val="1"/>
+          <w:bCs w:val="1"/>
+          <w:rtl w:val="0"/>
+        </w:rPr>
+        <w:t xml:space="preserve">trg_atualiza_saldo, </w:t>
+      </w:r>
+      <w:r>
+        <w:rPr>
+          <w:rtl w:val="0"/>
+        </w:rPr>
+        <w:t xml:space="preserve">ela foi adicionada na tabela lançamentos, executando a função criada anteriormente </w:t>
+      </w:r>
+      <w:r>
+        <w:rPr>
+          <w:b w:val="1"/>
+          <w:bCs w:val="1"/>
+          <w:rtl w:val="0"/>
+        </w:rPr>
+        <w:t xml:space="preserve">contabil</w:t>
+      </w:r>
+      <w:r>
+        <w:rPr>
+          <w:b w:val="1"/>
+          <w:bCs w:val="1"/>
+          <w:rtl w:val="0"/>
+        </w:rPr>
+        <w:t xml:space="preserve">.</w:t>
+      </w:r>
+      <w:r>
+        <w:rPr>
+          <w:b w:val="1"/>
+          <w:bCs w:val="1"/>
+          <w:rtl w:val="0"/>
+        </w:rPr>
+        <w:t xml:space="preserve">fn_atualiza_saldo</w:t>
+      </w:r>
+      <w:r>
+        <w:rPr>
+          <w:b w:val="1"/>
+          <w:bCs w:val="1"/>
+          <w:rtl w:val="0"/>
+        </w:rPr>
+        <w:t xml:space="preserve">(), </w:t>
+      </w:r>
+      <w:r>
+        <w:rPr>
+          <w:rtl w:val="0"/>
+        </w:rPr>
+        <w:t xml:space="preserve">a função vai disparar um evento onde </w:t>
+      </w:r>
+      <w:r>
+        <w:rPr>
+          <w:b w:val="1"/>
+          <w:bCs w:val="1"/>
+          <w:rtl w:val="0"/>
+        </w:rPr>
+        <w:t xml:space="preserve">não </w:t>
+      </w:r>
+      <w:r>
+        <w:rPr>
+          <w:rtl w:val="0"/>
+        </w:rPr>
+        <w:t xml:space="preserve">vai deixar o valor do lançamento ser menor que 0 e vai aplicar a regra de saldo com base nos novos lançamentos.</w:t>
+      </w:r>
+    </w:p>
+    <w:p>
+      <w:pPr>
+        <w:ind w:left="0" w:firstLine="720"/>
+        <w:rPr/>
+      </w:pPr>
+      <w:r>
+        <w:rPr>
+          <w:rtl w:val="0"/>
+        </w:rPr>
+        <w:t xml:space="preserve">Foi adicionado a carga de dados do schema </w:t>
+      </w:r>
+      <w:r>
+        <w:rPr>
+          <w:b w:val="1"/>
+          <w:bCs w:val="1"/>
+          <w:rtl w:val="0"/>
+        </w:rPr>
+        <w:t xml:space="preserve">contabil</w:t>
+      </w:r>
+      <w:r>
+        <w:rPr>
+          <w:rtl w:val="0"/>
+        </w:rPr>
+        <w:t xml:space="preserve"> e também consultas relacionadas as atividades propostas, com explicações e algumas consultas de testes, como exemplo , foi criada uma consulta que soma todos os saldos com base na natureza da conta, para poder ver o total.</w:t>
+      </w:r>
+      <w:r>
+        <w:rPr>
+          <w:rtl w:val="0"/>
+        </w:rPr>
+      </w:r>
+    </w:p>
+    <w:p>
+      <w:pPr>
+        <w:ind w:left="0" w:firstLine="0"/>
+        <w:rPr/>
+      </w:pPr>
+      <w:r>
+        <w:rPr>
+          <w:rtl w:val="0"/>
+        </w:rPr>
+      </w:r>
+    </w:p>
+    <w:p>
+      <w:pPr>
+        <w:ind w:left="0" w:firstLine="0"/>
+        <w:rPr>
+          <w:b w:val="1"/>
+          <w:bCs w:val="1"/>
+        </w:rPr>
+      </w:pPr>
+      <w:r>
+        <w:rPr>
+          <w:rtl w:val="0"/>
+        </w:rPr>
+      </w:r>
+    </w:p>
+    <w:p>
+      <w:pPr>
+        <w:ind w:left="0" w:firstLine="0"/>
+        <w:rPr>
+          <w:b w:val="1"/>
+          <w:bCs w:val="1"/>
+        </w:rPr>
+      </w:pPr>
+      <w:r>
+        <w:rPr>
+          <w:rtl w:val="0"/>
+        </w:rPr>
       </w:r>
     </w:p>
     <w:p>
@@ -1668,31 +2350,52 @@
           <w:smallCaps w:val="0"/>
           <w:strike w:val="0"/>
           <w:color w:val="000000"/>
-          <w:sz w:val="24"/>
-          <w:szCs w:val="24"/>
-          <w:u w:val="none"/>
-          <w:shd w:fill="auto" w:val="clear"/>
-          <w:vertAlign w:val="baseline"/>
-        </w:rPr>
-      </w:pPr>
-      <w:r>
-        <w:rPr>
-          <w:rFonts w:ascii="Times New Roman" w:cs="Times New Roman" w:eastAsia="Times New Roman" w:hAnsi="Times New Roman"/>
-          <w:b w:val="1"/>
-          <w:bCs w:val="1"/>
-          <w:i w:val="0"/>
-          <w:iCs w:val="0"/>
-          <w:smallCaps w:val="0"/>
-          <w:strike w:val="0"/>
-          <w:color w:val="000000"/>
-          <w:sz w:val="24"/>
-          <w:szCs w:val="24"/>
-          <w:u w:val="none"/>
-          <w:shd w:fill="auto" w:val="clear"/>
-          <w:vertAlign w:val="baseline"/>
-          <w:rtl w:val="0"/>
-        </w:rPr>
-        <w:t xml:space="preserve">10 RESULTADOS E DISCUSSÃO</w:t>
+          <w:u w:val="none"/>
+          <w:shd w:fill="auto" w:val="clear"/>
+          <w:vertAlign w:val="baseline"/>
+        </w:rPr>
+      </w:pPr>
+      <w:r>
+        <w:rPr>
+          <w:rFonts w:ascii="Times New Roman" w:cs="Times New Roman" w:eastAsia="Times New Roman" w:hAnsi="Times New Roman"/>
+          <w:b w:val="1"/>
+          <w:bCs w:val="1"/>
+          <w:i w:val="0"/>
+          <w:iCs w:val="0"/>
+          <w:smallCaps w:val="0"/>
+          <w:strike w:val="0"/>
+          <w:color w:val="000000"/>
+          <w:u w:val="none"/>
+          <w:shd w:fill="auto" w:val="clear"/>
+          <w:vertAlign w:val="baseline"/>
+          <w:rtl w:val="0"/>
+        </w:rPr>
+        <w:t xml:space="preserve">1</w:t>
+      </w:r>
+      <w:r>
+        <w:rPr>
+          <w:b w:val="1"/>
+          <w:bCs w:val="1"/>
+          <w:rtl w:val="0"/>
+        </w:rPr>
+        <w:t xml:space="preserve">1</w:t>
+      </w:r>
+      <w:r>
+        <w:rPr>
+          <w:rFonts w:ascii="Times New Roman" w:cs="Times New Roman" w:eastAsia="Times New Roman" w:hAnsi="Times New Roman"/>
+          <w:b w:val="1"/>
+          <w:bCs w:val="1"/>
+          <w:i w:val="0"/>
+          <w:iCs w:val="0"/>
+          <w:smallCaps w:val="0"/>
+          <w:strike w:val="0"/>
+          <w:color w:val="000000"/>
+          <w:u w:val="none"/>
+          <w:shd w:fill="auto" w:val="clear"/>
+          <w:vertAlign w:val="baseline"/>
+          <w:rtl w:val="0"/>
+        </w:rPr>
+        <w:t xml:space="preserve"> -  RESULTADOS E DISCUSSÃO</w:t>
       </w:r>
     </w:p>
     <w:p>
@@ -1778,7 +2481,34 @@
           <w:vertAlign w:val="baseline"/>
           <w:rtl w:val="0"/>
         </w:rPr>
-        <w:t xml:space="preserve">11 CONSIDERAÇÕES FINAIS</w:t>
+        <w:t xml:space="preserve">12</w:t>
+      </w:r>
+      <w:r>
+        <w:rPr>
+          <w:b w:val="1"/>
+          <w:bCs w:val="1"/>
+          <w:rtl w:val="0"/>
+        </w:rPr>
+        <w:t xml:space="preserve"> -  </w:t>
+      </w:r>
+      <w:r>
+        <w:rPr>
+          <w:rFonts w:ascii="Times New Roman" w:cs="Times New Roman" w:eastAsia="Times New Roman" w:hAnsi="Times New Roman"/>
+          <w:b w:val="1"/>
+          <w:bCs w:val="1"/>
+          <w:i w:val="0"/>
+          <w:iCs w:val="0"/>
+          <w:smallCaps w:val="0"/>
+          <w:strike w:val="0"/>
+          <w:color w:val="000000"/>
+          <w:sz w:val="24"/>
+          <w:szCs w:val="24"/>
+          <w:u w:val="none"/>
+          <w:shd w:fill="auto" w:val="clear"/>
+          <w:vertAlign w:val="baseline"/>
+          <w:rtl w:val="0"/>
+        </w:rPr>
+        <w:t xml:space="preserve">CONSIDERAÇÕES FINAIS</w:t>
       </w:r>
     </w:p>
     <w:p>
@@ -1831,6 +2561,9 @@
         <w:spacing w:after="120" w:before="240" w:line="360" w:lineRule="auto"/>
         <w:ind w:left="0" w:right="0" w:firstLine="0"/>
         <w:jc w:val="left"/>
+        <w:rPr/>
+      </w:pPr>
+      <w:r>
         <w:rPr>
           <w:rFonts w:ascii="Times New Roman" w:cs="Times New Roman" w:eastAsia="Times New Roman" w:hAnsi="Times New Roman"/>
           <w:b w:val="1"/>
@@ -1845,8 +2578,18 @@
           <w:u w:val="none"/>
           <w:shd w:fill="auto" w:val="clear"/>
           <w:vertAlign w:val="baseline"/>
-        </w:rPr>
-      </w:pPr>
+          <w:rtl w:val="0"/>
+        </w:rPr>
+        <w:t xml:space="preserve">1</w:t>
+      </w:r>
+      <w:r>
+        <w:rPr>
+          <w:b w:val="1"/>
+          <w:bCs w:val="1"/>
+          <w:rtl w:val="0"/>
+        </w:rPr>
+        <w:t xml:space="preserve">3 -  </w:t>
+      </w:r>
       <w:r>
         <w:rPr>
           <w:rFonts w:ascii="Times New Roman" w:cs="Times New Roman" w:eastAsia="Times New Roman" w:hAnsi="Times New Roman"/>
@@ -1864,31 +2607,20 @@
           <w:vertAlign w:val="baseline"/>
           <w:rtl w:val="0"/>
         </w:rPr>
-        <w:t xml:space="preserve">12 REFERÊNCIAS</w:t>
-      </w:r>
-    </w:p>
-    <w:p>
-      <w:pPr>
-        <w:ind w:left="709" w:firstLine="0"/>
-        <w:rPr/>
-      </w:pPr>
-      <w:r>
-        <w:rPr>
-          <w:rtl w:val="0"/>
-        </w:rPr>
-        <w:t xml:space="preserve">DATE, C. J. Introdução a sistemas de bancos de dados. Rio de Janeiro: Elsevier.</w:t>
-      </w:r>
-    </w:p>
-    <w:p>
-      <w:pPr>
-        <w:ind w:left="709" w:firstLine="0"/>
-        <w:rPr/>
-      </w:pPr>
-      <w:r>
-        <w:rPr>
-          <w:rtl w:val="0"/>
-        </w:rPr>
-        <w:t xml:space="preserve">ELMASRI, R.; NAVATHE, S. B. Sistemas de banco de dados. São Paulo: Pearson.</w:t>
+        <w:t xml:space="preserve">REFERÊNCIA</w:t>
+      </w:r>
+      <w:r>
+        <w:rPr>
+          <w:b w:val="1"/>
+          <w:bCs w:val="1"/>
+          <w:rtl w:val="0"/>
+        </w:rPr>
+        <w:t xml:space="preserve">S</w:t>
+      </w:r>
+      <w:r>
+        <w:rPr>
+          <w:rtl w:val="0"/>
+        </w:rPr>
       </w:r>
     </w:p>
     <w:p>
@@ -1931,7 +2663,6 @@
     <w:pPr>
       <w:keepNext w:val="0"/>
       <w:keepLines w:val="0"/>
-      <w:pageBreakBefore w:val="0"/>
       <w:widowControl w:val="1"/>
       <w:pBdr>
         <w:top w:space="0" w:sz="0" w:val="nil"/>
@@ -1964,27 +2695,6 @@
         <w:vertAlign w:val="baseline"/>
       </w:rPr>
     </w:pPr>
-    <w:r>
-      <w:rPr>
-        <w:rFonts w:ascii="Times New Roman" w:cs="Times New Roman" w:eastAsia="Times New Roman" w:hAnsi="Times New Roman"/>
-        <w:b w:val="0"/>
-        <w:bCs w:val="0"/>
-        <w:i w:val="0"/>
-        <w:iCs w:val="0"/>
-        <w:smallCaps w:val="0"/>
-        <w:strike w:val="0"/>
-        <w:color w:val="000000"/>
-        <w:sz w:val="24"/>
-        <w:szCs w:val="24"/>
-        <w:u w:val="none"/>
-        <w:shd w:fill="auto" w:val="clear"/>
-        <w:vertAlign w:val="baseline"/>
-      </w:rPr>
-      <w:fldChar w:fldCharType="begin"/>
-      <w:instrText xml:space="preserve">PAGE</w:instrText>
-      <w:fldChar w:fldCharType="separate"/>
-      <w:fldChar w:fldCharType="end"/>
-    </w:r>
     <w:r>
       <w:rPr>
         <w:rtl w:val="0"/>

</xml_diff>